<commit_message>
Add operating-hours placeholders + Stage 0 questions
- YOUR_HOURS_WEEKDAY (default "13:00 - 23:00")
- YOUR_HOURS_WEEKEND (default "19:00 - 23:00")
- YOUR_AUTO_OFF_HOUR (default 23) replaces the hardcoded setInterval
  that shut the WhatsApp bot at exactly 23:00 in both customer and
  admin HTML

template-agent substitution table, orchestrator.md Stage 0, and
SETUP-GUIDE-ver2.md all updated. Skipping the question yields the
old default, so existing behavior is preserved.

Co-Authored-By: Claude Opus 4.7 (1M context) <noreply@anthropic.com>
</commit_message>
<xml_diff>
--- a/מערך-סוכנים-להקמת-אתרים.docx
+++ b/מערך-סוכנים-להקמת-אתרים.docx
@@ -266,38 +266,35 @@
         <w:t>Do these substitutions **inside the target tree only** (never edit the source):</w:t>
         <w:br/>
         <w:br/>
-        <w:t>| Find (literal) | Replace with |</w:t>
+        <w:t>| Find (literal) | Replace with | Default if business field empty |</w:t>
         <w:br/>
-        <w:t>|---|---|</w:t>
+        <w:t>|---|---|---|</w:t>
         <w:br/>
-        <w:t>| `YOUR_PROJECT_ID-order` | `&lt;new_name&gt;-order` |</w:t>
+        <w:t>| `YOUR_PROJECT_ID-order` | `&lt;new_name&gt;-order` | — |</w:t>
         <w:br/>
-        <w:t>| `YOUR_PROJECT_ID-admin` | `&lt;new_name&gt;-admin` |</w:t>
+        <w:t>| `YOUR_PROJECT_ID-admin` | `&lt;new_name&gt;-admin` | — |</w:t>
         <w:br/>
-        <w:t>| `YOUR_PROJECT_ID.bybe.co.il` | `&lt;new_name&gt;.bybe.co.il` |</w:t>
+        <w:t>| `YOUR_PROJECT_ID.bybe.co.il` | `&lt;new_name&gt;.bybe.co.il` | — |</w:t>
         <w:br/>
-        <w:t>| `YOUR_PROJECT_ID` (remaining) | `&lt;new_name&gt;` |</w:t>
+        <w:t>| `YOUR_PROJECT_ID` (remaining) | `&lt;new_name&gt;` | — |</w:t>
         <w:br/>
-        <w:t>| `YOUR_DISPLAY_NAME` | `&lt;display_name&gt;` |</w:t>
+        <w:t>| `YOUR_DISPLAY_NAME` | `&lt;display_name&gt;` | — |</w:t>
         <w:br/>
-        <w:t>| `YOUR_ORDER_DOMAIN` | `&lt;new_name&gt;.bybe.co.il` |</w:t>
+        <w:t>| `YOUR_ORDER_DOMAIN` | `&lt;new_name&gt;.bybe.co.il` | — |</w:t>
         <w:br/>
-        <w:t>| `YOUR_ADMIN_DOMAIN` | `&lt;new_name&gt;-admin.web.app` |</w:t>
+        <w:t>| `YOUR_ADMIN_DOMAIN` | `&lt;new_name&gt;-admin.web.app` | — |</w:t>
+        <w:br/>
+        <w:t>| `YOUR_HOURS_WEEKDAY` | `&lt;business.hours_weekday&gt;` | `13:00 - 23:00` |</w:t>
+        <w:br/>
+        <w:t>| `YOUR_HOURS_WEEKEND` | `&lt;business.hours_weekend&gt;` | `19:00 - 23:00` |</w:t>
+        <w:br/>
+        <w:t>| `YOUR_AUTO_OFF_HOUR` | integer hour derived from `business.hours_weekday` close time, or `&lt;business.auto_off_hour&gt;` if explicitly set | `23` |</w:t>
         <w:br/>
         <w:br/>
         <w:t>Target file globs: `**/*.html`, `**/*.json`, `**/*.firebaserc`, `**/firebase.json`, `**/*.md`.</w:t>
         <w:br/>
         <w:br/>
-        <w:t>The **order matters** — replace the qualified forms (`-order`, `-admin`, `.bybe.co.il`) before the bare `YOUR_PROJECT_ID`, so the bare-name pass doesn't corrupt earlier substitutions.</w:t>
-        <w:br/>
-        <w:br/>
-        <w:t>### 3b. Business data substitutions</w:t>
-        <w:br/>
-        <w:br/>
-        <w:t>Apply **only if** the corresponding `business` field is non-empty. Skip silently if missing or empty string.</w:t>
-        <w:br/>
-        <w:br/>
-        <w:t>First, compute SHA-256 hashes for passwords using Node.js (available with</w:t>
+        <w:t>The **order matters** — replace the qualified form</w:t>
         <w:br/>
         <w:t>...</w:t>
       </w:r>

</xml_diff>

<commit_message>
Rebuild docx after hours-placeholder merge
</commit_message>
<xml_diff>
--- a/מערך-סוכנים-להקמת-אתרים.docx
+++ b/מערך-סוכנים-להקמת-אתרים.docx
@@ -160,7 +160,7 @@
           <w:b/>
           <w:sz w:val="22"/>
         </w:rPr>
-        <w:t>Top-level coordinator for spinning up a brand-new pizzeria site end-to-end. Use when the user says "set up pizza-&lt;X&gt;", "הקם פיצרייה &lt;X&gt;", or "build a new site for &lt;X&gt;". Takes the pizzeria name, clones the base template, provisions a new Firebase project, wires DNS under bybe.co.il, deploys, and verifies. Delegates every stage — never does domain/DNS/Firebase/deploy work itself.</w:t>
+        <w:t>Top-level coordinator for spinning up a brand-new pizzeria end-to-end. Use when the user says "set up pizza-&lt;X&gt;", "הקם פיצרייה &lt;X&gt;", or "build a new site for &lt;X&gt;". Produces two live sites: https://&lt;X&gt;.bybe.co.il (ordering) and https://&lt;X&gt;-admin.bybe.co.il (manager panel). Delegates every stage — never does domain/DNS/Firebase/deploy work itself.</w:t>
       </w:r>
     </w:p>
     <w:p>
@@ -170,7 +170,7 @@
           <w:color w:val="333333"/>
           <w:sz w:val="20"/>
         </w:rPr>
-        <w:t>You are the Orchestrator. You turn "set up pizzeria &lt;X&gt;" into a live site at `https://&lt;X&gt;.bybe.co.il`. You are the only agent that plans — every other agent executes one thing.</w:t>
+        <w:t>You are the Orchestrator. You turn "set up pizzeria &lt;X&gt;" into two live sites: `https://&lt;X&gt;.bybe.co.il` (customer ordering) and `https://&lt;X&gt;-admin.bybe.co.il` (manager panel). You are the only agent that plans — every other agent executes one thing.</w:t>
         <w:br/>
         <w:br/>
         <w:t>## Reference</w:t>
@@ -282,7 +282,7 @@
         <w:br/>
         <w:t>| `YOUR_ORDER_DOMAIN` | `&lt;new_name&gt;.bybe.co.il` | — |</w:t>
         <w:br/>
-        <w:t>| `YOUR_ADMIN_DOMAIN` | `&lt;new_name&gt;-admin.web.app` | — |</w:t>
+        <w:t>| `YOUR_ADMIN_DOMAIN` | `&lt;new_name&gt;-admin.bybe.co.il` | — |</w:t>
         <w:br/>
         <w:t>| `YOUR_HOURS_WEEKDAY` | `&lt;business.hours_weekday&gt;` | `13:00 - 23:00` |</w:t>
         <w:br/>
@@ -294,7 +294,7 @@
         <w:t>Target file globs: `**/*.html`, `**/*.json`, `**/*.firebaserc`, `**/firebase.json`, `**/*.md`.</w:t>
         <w:br/>
         <w:br/>
-        <w:t>The **order matters** — replace the qualified form</w:t>
+        <w:t>The **order matters** — replace the qualified f</w:t>
         <w:br/>
         <w:t>...</w:t>
       </w:r>

</xml_diff>

<commit_message>
Split weekend hours into Friday + Saturday placeholders
</commit_message>
<xml_diff>
--- a/מערך-סוכנים-להקמת-אתרים.docx
+++ b/מערך-סוכנים-להקמת-אתרים.docx
@@ -286,15 +286,14 @@
         <w:br/>
         <w:t>| `YOUR_HOURS_WEEKDAY` | `&lt;business.hours_weekday&gt;` | `13:00 - 23:00` |</w:t>
         <w:br/>
-        <w:t>| `YOUR_HOURS_WEEKEND` | `&lt;business.hours_weekend&gt;` | `19:00 - 23:00` |</w:t>
+        <w:t>| `YOUR_HOURS_FRIDAY` | `&lt;business.hours_friday&gt;` | `13:00 - 15:00` |</w:t>
+        <w:br/>
+        <w:t>| `YOUR_HOURS_SATURDAY` | `&lt;business.hours_saturday&gt;` | `19:00 - 23:00` |</w:t>
         <w:br/>
         <w:t>| `YOUR_AUTO_OFF_HOUR` | integer hour derived from `business.hours_weekday` close time, or `&lt;business.auto_off_hour&gt;` if explicitly set | `23` |</w:t>
         <w:br/>
         <w:br/>
-        <w:t>Target file globs: `**/*.html`, `**/*.json`, `**/*.firebaserc`, `**/firebase.json`, `**/*.md`.</w:t>
-        <w:br/>
-        <w:br/>
-        <w:t>The **order matters** — replace the qualified f</w:t>
+        <w:t>For the three hours fields, if the user answers `סגור` / `closed` / `0`</w:t>
         <w:br/>
         <w:t>...</w:t>
       </w:r>

</xml_diff>

<commit_message>
Remove time-based bot auto-shutdown; hours are display-only
The old setInterval that called stopBot() at YOUR_AUTO_OFF_HOUR:00
contradicted the manual-only control model (admin's bot button writes
settings/storeOpen; customer reads it). Per user: hours should only
appear as static display text, never drive open/closed logic.

- Remove setInterval block + YOUR_AUTO_OFF_HOUR references from both
  template HTMLs
- Drop YOUR_AUTO_OFF_HOUR row from template-agent substitution table
  and note that hours are display-only
- Drop auto_off_hour derivation from orchestrator Stage 0
- SETUP-GUIDE-ver2 7א reworded: "display only"
- Rebuild docx
</commit_message>
<xml_diff>
--- a/מערך-סוכנים-להקמת-אתרים.docx
+++ b/מערך-סוכנים-להקמת-אתרים.docx
@@ -290,11 +290,14 @@
         <w:br/>
         <w:t>| `YOUR_HOURS_SATURDAY` | `&lt;business.hours_saturday&gt;` | `19:00 - 23:00` |</w:t>
         <w:br/>
-        <w:t>| `YOUR_AUTO_OFF_HOUR` | integer hour derived from `business.hours_weekday` close time, or `&lt;business.auto_off_hour&gt;` if explicitly set | `23` |</w:t>
-        <w:br/>
         <w:t>| `YOUR_PHONE` | `&lt;business.phone&gt;` | leave placeholder |</w:t>
         <w:br/>
-        <w:t>| `YOUR_ADDRES</w:t>
+        <w:t>| `YOUR_ADDRESS` | `&lt;business.address&gt;` | leave placeholder |</w:t>
+        <w:br/>
+        <w:t>| `YOUR_CITY` | `&lt;business.city&gt;` | leave placeholder |</w:t>
+        <w:br/>
+        <w:br/>
+        <w:t xml:space="preserve">For the three hours fields, if the user </w:t>
         <w:br/>
         <w:t>...</w:t>
       </w:r>

</xml_diff>